<commit_message>
ultima funcion del hito1
</commit_message>
<xml_diff>
--- a/HITO1/HITO1.docx
+++ b/HITO1/HITO1.docx
@@ -84,27 +84,885 @@
       </w:r>
     </w:p>
     <w:p>
+      <w:r>
+        <w:t xml:space="preserve">Básicamente aprendí la sintaxis de Python, sus tipos de colecciones, como definir funciones y el uso de las más comunes y POO brevemente y como interactuar con </w:t>
+      </w:r>
+      <w:proofErr w:type="spellStart"/>
+      <w:r>
+        <w:t>APIs</w:t>
+      </w:r>
+      <w:proofErr w:type="spellEnd"/>
+      <w:r>
+        <w:t xml:space="preserve"> </w:t>
+      </w:r>
+      <w:r>
+        <w:lastRenderedPageBreak/>
+        <w:t xml:space="preserve">externas, manejo de excepciones y cómo funciona la organización en módulos, también aprendí a configurar </w:t>
+      </w:r>
+      <w:proofErr w:type="spellStart"/>
+      <w:r>
+        <w:t>git</w:t>
+      </w:r>
+      <w:proofErr w:type="spellEnd"/>
+      <w:r>
+        <w:t xml:space="preserve"> y como crear un repositorio desde mi carpeta para luego subirlo a </w:t>
+      </w:r>
+      <w:proofErr w:type="spellStart"/>
+      <w:r>
+        <w:t>github</w:t>
+      </w:r>
+      <w:proofErr w:type="spellEnd"/>
+      <w:r>
+        <w:t>.</w:t>
+      </w:r>
+    </w:p>
+    <w:p>
+      <w:r>
+        <w:t xml:space="preserve">También aprendí la importancia de tener entornos virtuales y cómo configurarlos con Python -m </w:t>
+      </w:r>
+      <w:proofErr w:type="spellStart"/>
+      <w:r>
+        <w:t>venv</w:t>
+      </w:r>
+      <w:proofErr w:type="spellEnd"/>
+      <w:r>
+        <w:t xml:space="preserve"> “nombre”, para que cada proyecto tenga sus propias librerías y no haya conflicto si dos proyectos usan distintas versiones de una librería</w:t>
+      </w:r>
+    </w:p>
+    <w:p/>
+    <w:p>
+      <w:r>
+        <w:t>REPASÉ LOS COMANDOS BÁSICOS DE LINUX</w:t>
+      </w:r>
+    </w:p>
+    <w:p>
       <w:pPr>
         <w:rPr>
-          <w:b/>
-          <w:color w:val="262626" w:themeColor="text1" w:themeTint="D9"/>
-          <w:sz w:val="40"/>
-          <w:szCs w:val="40"/>
-          <w14:shadow w14:blurRad="0" w14:dist="38100" w14:dir="2700000" w14:sx="100000" w14:sy="100000" w14:kx="0" w14:ky="0" w14:algn="bl">
-            <w14:schemeClr w14:val="accent5"/>
-          </w14:shadow>
-          <w14:textOutline w14:w="6731" w14:cap="flat" w14:cmpd="sng" w14:algn="ctr">
-            <w14:solidFill>
-              <w14:schemeClr w14:val="bg1"/>
-            </w14:solidFill>
+          <w:bCs/>
+          <w:color w:val="000000" w:themeColor="text1"/>
+          <w:sz w:val="20"/>
+          <w:szCs w:val="20"/>
+          <w14:shadow w14:blurRad="38100" w14:dist="19050" w14:dir="2700000" w14:sx="100000" w14:sy="100000" w14:kx="0" w14:ky="0" w14:algn="tl">
+            <w14:schemeClr w14:val="dk1">
+              <w14:alpha w14:val="60000"/>
+            </w14:schemeClr>
+          </w14:shadow>
+          <w14:textOutline w14:w="0" w14:cap="flat" w14:cmpd="sng" w14:algn="ctr">
+            <w14:noFill/>
             <w14:prstDash w14:val="solid"/>
             <w14:round/>
           </w14:textOutline>
         </w:rPr>
       </w:pPr>
       <w:r>
-        <w:lastRenderedPageBreak/>
-        <w:br/>
+        <w:rPr>
+          <w:bCs/>
+          <w:color w:val="000000" w:themeColor="text1"/>
+          <w:sz w:val="20"/>
+          <w:szCs w:val="20"/>
+          <w14:shadow w14:blurRad="38100" w14:dist="19050" w14:dir="2700000" w14:sx="100000" w14:sy="100000" w14:kx="0" w14:ky="0" w14:algn="tl">
+            <w14:schemeClr w14:val="dk1">
+              <w14:alpha w14:val="60000"/>
+            </w14:schemeClr>
+          </w14:shadow>
+          <w14:textOutline w14:w="0" w14:cap="flat" w14:cmpd="sng" w14:algn="ctr">
+            <w14:noFill/>
+            <w14:prstDash w14:val="solid"/>
+            <w14:round/>
+          </w14:textOutline>
+        </w:rPr>
+        <w:t xml:space="preserve">  </w:t>
+      </w:r>
+      <w:proofErr w:type="spellStart"/>
+      <w:r>
+        <w:rPr>
+          <w:bCs/>
+          <w:color w:val="000000" w:themeColor="text1"/>
+          <w:sz w:val="20"/>
+          <w:szCs w:val="20"/>
+          <w14:shadow w14:blurRad="38100" w14:dist="19050" w14:dir="2700000" w14:sx="100000" w14:sy="100000" w14:kx="0" w14:ky="0" w14:algn="tl">
+            <w14:schemeClr w14:val="dk1">
+              <w14:alpha w14:val="60000"/>
+            </w14:schemeClr>
+          </w14:shadow>
+          <w14:textOutline w14:w="0" w14:cap="flat" w14:cmpd="sng" w14:algn="ctr">
+            <w14:noFill/>
+            <w14:prstDash w14:val="solid"/>
+            <w14:round/>
+          </w14:textOutline>
+        </w:rPr>
+        <w:t>ls</w:t>
+      </w:r>
+      <w:proofErr w:type="spellEnd"/>
+      <w:r>
+        <w:rPr>
+          <w:bCs/>
+          <w:color w:val="000000" w:themeColor="text1"/>
+          <w:sz w:val="20"/>
+          <w:szCs w:val="20"/>
+          <w14:shadow w14:blurRad="38100" w14:dist="19050" w14:dir="2700000" w14:sx="100000" w14:sy="100000" w14:kx="0" w14:ky="0" w14:algn="tl">
+            <w14:schemeClr w14:val="dk1">
+              <w14:alpha w14:val="60000"/>
+            </w14:schemeClr>
+          </w14:shadow>
+          <w14:textOutline w14:w="0" w14:cap="flat" w14:cmpd="sng" w14:algn="ctr">
+            <w14:noFill/>
+            <w14:prstDash w14:val="solid"/>
+            <w14:round/>
+          </w14:textOutline>
+        </w:rPr>
+        <w:t xml:space="preserve">, </w:t>
+      </w:r>
+      <w:proofErr w:type="spellStart"/>
+      <w:r>
+        <w:rPr>
+          <w:bCs/>
+          <w:color w:val="000000" w:themeColor="text1"/>
+          <w:sz w:val="20"/>
+          <w:szCs w:val="20"/>
+          <w14:shadow w14:blurRad="38100" w14:dist="19050" w14:dir="2700000" w14:sx="100000" w14:sy="100000" w14:kx="0" w14:ky="0" w14:algn="tl">
+            <w14:schemeClr w14:val="dk1">
+              <w14:alpha w14:val="60000"/>
+            </w14:schemeClr>
+          </w14:shadow>
+          <w14:textOutline w14:w="0" w14:cap="flat" w14:cmpd="sng" w14:algn="ctr">
+            <w14:noFill/>
+            <w14:prstDash w14:val="solid"/>
+            <w14:round/>
+          </w14:textOutline>
+        </w:rPr>
+        <w:t>ls</w:t>
+      </w:r>
+      <w:proofErr w:type="spellEnd"/>
+      <w:r>
+        <w:rPr>
+          <w:bCs/>
+          <w:color w:val="000000" w:themeColor="text1"/>
+          <w:sz w:val="20"/>
+          <w:szCs w:val="20"/>
+          <w14:shadow w14:blurRad="38100" w14:dist="19050" w14:dir="2700000" w14:sx="100000" w14:sy="100000" w14:kx="0" w14:ky="0" w14:algn="tl">
+            <w14:schemeClr w14:val="dk1">
+              <w14:alpha w14:val="60000"/>
+            </w14:schemeClr>
+          </w14:shadow>
+          <w14:textOutline w14:w="0" w14:cap="flat" w14:cmpd="sng" w14:algn="ctr">
+            <w14:noFill/>
+            <w14:prstDash w14:val="solid"/>
+            <w14:round/>
+          </w14:textOutline>
+        </w:rPr>
+        <w:t xml:space="preserve"> -la → listar </w:t>
+      </w:r>
+      <w:r>
+        <w:rPr>
+          <w:bCs/>
+          <w:color w:val="000000" w:themeColor="text1"/>
+          <w:sz w:val="20"/>
+          <w:szCs w:val="20"/>
+          <w:u w:val="single"/>
+          <w14:shadow w14:blurRad="38100" w14:dist="19050" w14:dir="2700000" w14:sx="100000" w14:sy="100000" w14:kx="0" w14:ky="0" w14:algn="tl">
+            <w14:schemeClr w14:val="dk1">
+              <w14:alpha w14:val="60000"/>
+            </w14:schemeClr>
+          </w14:shadow>
+          <w14:textOutline w14:w="0" w14:cap="flat" w14:cmpd="sng" w14:algn="ctr">
+            <w14:noFill/>
+            <w14:prstDash w14:val="solid"/>
+            <w14:round/>
+          </w14:textOutline>
+        </w:rPr>
+        <w:t>archivos</w:t>
+      </w:r>
+      <w:r>
+        <w:rPr>
+          <w:bCs/>
+          <w:color w:val="000000" w:themeColor="text1"/>
+          <w:sz w:val="20"/>
+          <w:szCs w:val="20"/>
+          <w14:shadow w14:blurRad="38100" w14:dist="19050" w14:dir="2700000" w14:sx="100000" w14:sy="100000" w14:kx="0" w14:ky="0" w14:algn="tl">
+            <w14:schemeClr w14:val="dk1">
+              <w14:alpha w14:val="60000"/>
+            </w14:schemeClr>
+          </w14:shadow>
+          <w14:textOutline w14:w="0" w14:cap="flat" w14:cmpd="sng" w14:algn="ctr">
+            <w14:noFill/>
+            <w14:prstDash w14:val="solid"/>
+            <w14:round/>
+          </w14:textOutline>
+        </w:rPr>
+        <w:t xml:space="preserve"> </w:t>
+      </w:r>
+    </w:p>
+    <w:p>
+      <w:pPr>
+        <w:rPr>
+          <w:bCs/>
+          <w:color w:val="000000" w:themeColor="text1"/>
+          <w:sz w:val="20"/>
+          <w:szCs w:val="20"/>
+          <w14:shadow w14:blurRad="38100" w14:dist="19050" w14:dir="2700000" w14:sx="100000" w14:sy="100000" w14:kx="0" w14:ky="0" w14:algn="tl">
+            <w14:schemeClr w14:val="dk1">
+              <w14:alpha w14:val="60000"/>
+            </w14:schemeClr>
+          </w14:shadow>
+          <w14:textOutline w14:w="0" w14:cap="flat" w14:cmpd="sng" w14:algn="ctr">
+            <w14:noFill/>
+            <w14:prstDash w14:val="solid"/>
+            <w14:round/>
+          </w14:textOutline>
+        </w:rPr>
+      </w:pPr>
+      <w:r>
+        <w:rPr>
+          <w:bCs/>
+          <w:color w:val="000000" w:themeColor="text1"/>
+          <w:sz w:val="20"/>
+          <w:szCs w:val="20"/>
+          <w14:shadow w14:blurRad="38100" w14:dist="19050" w14:dir="2700000" w14:sx="100000" w14:sy="100000" w14:kx="0" w14:ky="0" w14:algn="tl">
+            <w14:schemeClr w14:val="dk1">
+              <w14:alpha w14:val="60000"/>
+            </w14:schemeClr>
+          </w14:shadow>
+          <w14:textOutline w14:w="0" w14:cap="flat" w14:cmpd="sng" w14:algn="ctr">
+            <w14:noFill/>
+            <w14:prstDash w14:val="solid"/>
+            <w14:round/>
+          </w14:textOutline>
+        </w:rPr>
+        <w:t xml:space="preserve">  cd, cd .., cd ~ → navegar </w:t>
+      </w:r>
+    </w:p>
+    <w:p>
+      <w:pPr>
+        <w:rPr>
+          <w:bCs/>
+          <w:color w:val="000000" w:themeColor="text1"/>
+          <w:sz w:val="20"/>
+          <w:szCs w:val="20"/>
+          <w14:shadow w14:blurRad="38100" w14:dist="19050" w14:dir="2700000" w14:sx="100000" w14:sy="100000" w14:kx="0" w14:ky="0" w14:algn="tl">
+            <w14:schemeClr w14:val="dk1">
+              <w14:alpha w14:val="60000"/>
+            </w14:schemeClr>
+          </w14:shadow>
+          <w14:textOutline w14:w="0" w14:cap="flat" w14:cmpd="sng" w14:algn="ctr">
+            <w14:noFill/>
+            <w14:prstDash w14:val="solid"/>
+            <w14:round/>
+          </w14:textOutline>
+        </w:rPr>
+      </w:pPr>
+      <w:r>
+        <w:rPr>
+          <w:bCs/>
+          <w:color w:val="000000" w:themeColor="text1"/>
+          <w:sz w:val="20"/>
+          <w:szCs w:val="20"/>
+          <w14:shadow w14:blurRad="38100" w14:dist="19050" w14:dir="2700000" w14:sx="100000" w14:sy="100000" w14:kx="0" w14:ky="0" w14:algn="tl">
+            <w14:schemeClr w14:val="dk1">
+              <w14:alpha w14:val="60000"/>
+            </w14:schemeClr>
+          </w14:shadow>
+          <w14:textOutline w14:w="0" w14:cap="flat" w14:cmpd="sng" w14:algn="ctr">
+            <w14:noFill/>
+            <w14:prstDash w14:val="solid"/>
+            <w14:round/>
+          </w14:textOutline>
+        </w:rPr>
+        <w:t xml:space="preserve">  </w:t>
+      </w:r>
+      <w:proofErr w:type="spellStart"/>
+      <w:r>
+        <w:rPr>
+          <w:bCs/>
+          <w:color w:val="000000" w:themeColor="text1"/>
+          <w:sz w:val="20"/>
+          <w:szCs w:val="20"/>
+          <w14:shadow w14:blurRad="38100" w14:dist="19050" w14:dir="2700000" w14:sx="100000" w14:sy="100000" w14:kx="0" w14:ky="0" w14:algn="tl">
+            <w14:schemeClr w14:val="dk1">
+              <w14:alpha w14:val="60000"/>
+            </w14:schemeClr>
+          </w14:shadow>
+          <w14:textOutline w14:w="0" w14:cap="flat" w14:cmpd="sng" w14:algn="ctr">
+            <w14:noFill/>
+            <w14:prstDash w14:val="solid"/>
+            <w14:round/>
+          </w14:textOutline>
+        </w:rPr>
+        <w:t>mkdir</w:t>
+      </w:r>
+      <w:proofErr w:type="spellEnd"/>
+      <w:r>
+        <w:rPr>
+          <w:bCs/>
+          <w:color w:val="000000" w:themeColor="text1"/>
+          <w:sz w:val="20"/>
+          <w:szCs w:val="20"/>
+          <w14:shadow w14:blurRad="38100" w14:dist="19050" w14:dir="2700000" w14:sx="100000" w14:sy="100000" w14:kx="0" w14:ky="0" w14:algn="tl">
+            <w14:schemeClr w14:val="dk1">
+              <w14:alpha w14:val="60000"/>
+            </w14:schemeClr>
+          </w14:shadow>
+          <w14:textOutline w14:w="0" w14:cap="flat" w14:cmpd="sng" w14:algn="ctr">
+            <w14:noFill/>
+            <w14:prstDash w14:val="solid"/>
+            <w14:round/>
+          </w14:textOutline>
+        </w:rPr>
+        <w:t xml:space="preserve">, </w:t>
+      </w:r>
+      <w:proofErr w:type="spellStart"/>
+      <w:r>
+        <w:rPr>
+          <w:bCs/>
+          <w:color w:val="000000" w:themeColor="text1"/>
+          <w:sz w:val="20"/>
+          <w:szCs w:val="20"/>
+          <w14:shadow w14:blurRad="38100" w14:dist="19050" w14:dir="2700000" w14:sx="100000" w14:sy="100000" w14:kx="0" w14:ky="0" w14:algn="tl">
+            <w14:schemeClr w14:val="dk1">
+              <w14:alpha w14:val="60000"/>
+            </w14:schemeClr>
+          </w14:shadow>
+          <w14:textOutline w14:w="0" w14:cap="flat" w14:cmpd="sng" w14:algn="ctr">
+            <w14:noFill/>
+            <w14:prstDash w14:val="solid"/>
+            <w14:round/>
+          </w14:textOutline>
+        </w:rPr>
+        <w:t>rm</w:t>
+      </w:r>
+      <w:proofErr w:type="spellEnd"/>
+      <w:r>
+        <w:rPr>
+          <w:bCs/>
+          <w:color w:val="000000" w:themeColor="text1"/>
+          <w:sz w:val="20"/>
+          <w:szCs w:val="20"/>
+          <w14:shadow w14:blurRad="38100" w14:dist="19050" w14:dir="2700000" w14:sx="100000" w14:sy="100000" w14:kx="0" w14:ky="0" w14:algn="tl">
+            <w14:schemeClr w14:val="dk1">
+              <w14:alpha w14:val="60000"/>
+            </w14:schemeClr>
+          </w14:shadow>
+          <w14:textOutline w14:w="0" w14:cap="flat" w14:cmpd="sng" w14:algn="ctr">
+            <w14:noFill/>
+            <w14:prstDash w14:val="solid"/>
+            <w14:round/>
+          </w14:textOutline>
+        </w:rPr>
+        <w:t xml:space="preserve"> -r → crear y borrar carpetas </w:t>
+      </w:r>
+    </w:p>
+    <w:p>
+      <w:pPr>
+        <w:rPr>
+          <w:bCs/>
+          <w:color w:val="000000" w:themeColor="text1"/>
+          <w:sz w:val="20"/>
+          <w:szCs w:val="20"/>
+          <w14:shadow w14:blurRad="38100" w14:dist="19050" w14:dir="2700000" w14:sx="100000" w14:sy="100000" w14:kx="0" w14:ky="0" w14:algn="tl">
+            <w14:schemeClr w14:val="dk1">
+              <w14:alpha w14:val="60000"/>
+            </w14:schemeClr>
+          </w14:shadow>
+          <w14:textOutline w14:w="0" w14:cap="flat" w14:cmpd="sng" w14:algn="ctr">
+            <w14:noFill/>
+            <w14:prstDash w14:val="solid"/>
+            <w14:round/>
+          </w14:textOutline>
+        </w:rPr>
+      </w:pPr>
+      <w:r>
+        <w:rPr>
+          <w:bCs/>
+          <w:color w:val="000000" w:themeColor="text1"/>
+          <w:sz w:val="20"/>
+          <w:szCs w:val="20"/>
+          <w14:shadow w14:blurRad="38100" w14:dist="19050" w14:dir="2700000" w14:sx="100000" w14:sy="100000" w14:kx="0" w14:ky="0" w14:algn="tl">
+            <w14:schemeClr w14:val="dk1">
+              <w14:alpha w14:val="60000"/>
+            </w14:schemeClr>
+          </w14:shadow>
+          <w14:textOutline w14:w="0" w14:cap="flat" w14:cmpd="sng" w14:algn="ctr">
+            <w14:noFill/>
+            <w14:prstDash w14:val="solid"/>
+            <w14:round/>
+          </w14:textOutline>
+        </w:rPr>
+        <w:t xml:space="preserve">  </w:t>
+      </w:r>
+      <w:proofErr w:type="spellStart"/>
+      <w:r>
+        <w:rPr>
+          <w:bCs/>
+          <w:color w:val="000000" w:themeColor="text1"/>
+          <w:sz w:val="20"/>
+          <w:szCs w:val="20"/>
+          <w14:shadow w14:blurRad="38100" w14:dist="19050" w14:dir="2700000" w14:sx="100000" w14:sy="100000" w14:kx="0" w14:ky="0" w14:algn="tl">
+            <w14:schemeClr w14:val="dk1">
+              <w14:alpha w14:val="60000"/>
+            </w14:schemeClr>
+          </w14:shadow>
+          <w14:textOutline w14:w="0" w14:cap="flat" w14:cmpd="sng" w14:algn="ctr">
+            <w14:noFill/>
+            <w14:prstDash w14:val="solid"/>
+            <w14:round/>
+          </w14:textOutline>
+        </w:rPr>
+        <w:t>touch</w:t>
+      </w:r>
+      <w:proofErr w:type="spellEnd"/>
+      <w:r>
+        <w:rPr>
+          <w:bCs/>
+          <w:color w:val="000000" w:themeColor="text1"/>
+          <w:sz w:val="20"/>
+          <w:szCs w:val="20"/>
+          <w14:shadow w14:blurRad="38100" w14:dist="19050" w14:dir="2700000" w14:sx="100000" w14:sy="100000" w14:kx="0" w14:ky="0" w14:algn="tl">
+            <w14:schemeClr w14:val="dk1">
+              <w14:alpha w14:val="60000"/>
+            </w14:schemeClr>
+          </w14:shadow>
+          <w14:textOutline w14:w="0" w14:cap="flat" w14:cmpd="sng" w14:algn="ctr">
+            <w14:noFill/>
+            <w14:prstDash w14:val="solid"/>
+            <w14:round/>
+          </w14:textOutline>
+        </w:rPr>
+        <w:t xml:space="preserve">, </w:t>
+      </w:r>
+      <w:proofErr w:type="spellStart"/>
+      <w:r>
+        <w:rPr>
+          <w:bCs/>
+          <w:color w:val="000000" w:themeColor="text1"/>
+          <w:sz w:val="20"/>
+          <w:szCs w:val="20"/>
+          <w14:shadow w14:blurRad="38100" w14:dist="19050" w14:dir="2700000" w14:sx="100000" w14:sy="100000" w14:kx="0" w14:ky="0" w14:algn="tl">
+            <w14:schemeClr w14:val="dk1">
+              <w14:alpha w14:val="60000"/>
+            </w14:schemeClr>
+          </w14:shadow>
+          <w14:textOutline w14:w="0" w14:cap="flat" w14:cmpd="sng" w14:algn="ctr">
+            <w14:noFill/>
+            <w14:prstDash w14:val="solid"/>
+            <w14:round/>
+          </w14:textOutline>
+        </w:rPr>
+        <w:t>cat</w:t>
+      </w:r>
+      <w:proofErr w:type="spellEnd"/>
+      <w:r>
+        <w:rPr>
+          <w:bCs/>
+          <w:color w:val="000000" w:themeColor="text1"/>
+          <w:sz w:val="20"/>
+          <w:szCs w:val="20"/>
+          <w14:shadow w14:blurRad="38100" w14:dist="19050" w14:dir="2700000" w14:sx="100000" w14:sy="100000" w14:kx="0" w14:ky="0" w14:algn="tl">
+            <w14:schemeClr w14:val="dk1">
+              <w14:alpha w14:val="60000"/>
+            </w14:schemeClr>
+          </w14:shadow>
+          <w14:textOutline w14:w="0" w14:cap="flat" w14:cmpd="sng" w14:algn="ctr">
+            <w14:noFill/>
+            <w14:prstDash w14:val="solid"/>
+            <w14:round/>
+          </w14:textOutline>
+        </w:rPr>
+        <w:t xml:space="preserve">, nano → crear y editar archivos </w:t>
+      </w:r>
+    </w:p>
+    <w:p>
+      <w:pPr>
+        <w:rPr>
+          <w:bCs/>
+          <w:color w:val="000000" w:themeColor="text1"/>
+          <w:sz w:val="20"/>
+          <w:szCs w:val="20"/>
+          <w14:shadow w14:blurRad="38100" w14:dist="19050" w14:dir="2700000" w14:sx="100000" w14:sy="100000" w14:kx="0" w14:ky="0" w14:algn="tl">
+            <w14:schemeClr w14:val="dk1">
+              <w14:alpha w14:val="60000"/>
+            </w14:schemeClr>
+          </w14:shadow>
+          <w14:textOutline w14:w="0" w14:cap="flat" w14:cmpd="sng" w14:algn="ctr">
+            <w14:noFill/>
+            <w14:prstDash w14:val="solid"/>
+            <w14:round/>
+          </w14:textOutline>
+        </w:rPr>
+      </w:pPr>
+      <w:r>
+        <w:rPr>
+          <w:bCs/>
+          <w:color w:val="000000" w:themeColor="text1"/>
+          <w:sz w:val="20"/>
+          <w:szCs w:val="20"/>
+          <w14:shadow w14:blurRad="38100" w14:dist="19050" w14:dir="2700000" w14:sx="100000" w14:sy="100000" w14:kx="0" w14:ky="0" w14:algn="tl">
+            <w14:schemeClr w14:val="dk1">
+              <w14:alpha w14:val="60000"/>
+            </w14:schemeClr>
+          </w14:shadow>
+          <w14:textOutline w14:w="0" w14:cap="flat" w14:cmpd="sng" w14:algn="ctr">
+            <w14:noFill/>
+            <w14:prstDash w14:val="solid"/>
+            <w14:round/>
+          </w14:textOutline>
+        </w:rPr>
+        <w:t xml:space="preserve">  echo + &gt; y &gt;&gt; → escribir en archivos </w:t>
+      </w:r>
+    </w:p>
+    <w:p>
+      <w:pPr>
+        <w:rPr>
+          <w:bCs/>
+          <w:color w:val="000000" w:themeColor="text1"/>
+          <w:sz w:val="20"/>
+          <w:szCs w:val="20"/>
+          <w14:shadow w14:blurRad="38100" w14:dist="19050" w14:dir="2700000" w14:sx="100000" w14:sy="100000" w14:kx="0" w14:ky="0" w14:algn="tl">
+            <w14:schemeClr w14:val="dk1">
+              <w14:alpha w14:val="60000"/>
+            </w14:schemeClr>
+          </w14:shadow>
+          <w14:textOutline w14:w="0" w14:cap="flat" w14:cmpd="sng" w14:algn="ctr">
+            <w14:noFill/>
+            <w14:prstDash w14:val="solid"/>
+            <w14:round/>
+          </w14:textOutline>
+        </w:rPr>
+      </w:pPr>
+      <w:r>
+        <w:rPr>
+          <w:bCs/>
+          <w:color w:val="000000" w:themeColor="text1"/>
+          <w:sz w:val="20"/>
+          <w:szCs w:val="20"/>
+          <w14:shadow w14:blurRad="38100" w14:dist="19050" w14:dir="2700000" w14:sx="100000" w14:sy="100000" w14:kx="0" w14:ky="0" w14:algn="tl">
+            <w14:schemeClr w14:val="dk1">
+              <w14:alpha w14:val="60000"/>
+            </w14:schemeClr>
+          </w14:shadow>
+          <w14:textOutline w14:w="0" w14:cap="flat" w14:cmpd="sng" w14:algn="ctr">
+            <w14:noFill/>
+            <w14:prstDash w14:val="solid"/>
+            <w14:round/>
+          </w14:textOutline>
+        </w:rPr>
+        <w:t xml:space="preserve">  grep → buscar texto </w:t>
+      </w:r>
+    </w:p>
+    <w:p>
+      <w:pPr>
+        <w:rPr>
+          <w:bCs/>
+          <w:color w:val="000000" w:themeColor="text1"/>
+          <w:sz w:val="20"/>
+          <w:szCs w:val="20"/>
+          <w14:shadow w14:blurRad="38100" w14:dist="19050" w14:dir="2700000" w14:sx="100000" w14:sy="100000" w14:kx="0" w14:ky="0" w14:algn="tl">
+            <w14:schemeClr w14:val="dk1">
+              <w14:alpha w14:val="60000"/>
+            </w14:schemeClr>
+          </w14:shadow>
+          <w14:textOutline w14:w="0" w14:cap="flat" w14:cmpd="sng" w14:algn="ctr">
+            <w14:noFill/>
+            <w14:prstDash w14:val="solid"/>
+            <w14:round/>
+          </w14:textOutline>
+        </w:rPr>
+      </w:pPr>
+      <w:r>
+        <w:rPr>
+          <w:bCs/>
+          <w:color w:val="000000" w:themeColor="text1"/>
+          <w:sz w:val="20"/>
+          <w:szCs w:val="20"/>
+          <w14:shadow w14:blurRad="38100" w14:dist="19050" w14:dir="2700000" w14:sx="100000" w14:sy="100000" w14:kx="0" w14:ky="0" w14:algn="tl">
+            <w14:schemeClr w14:val="dk1">
+              <w14:alpha w14:val="60000"/>
+            </w14:schemeClr>
+          </w14:shadow>
+          <w14:textOutline w14:w="0" w14:cap="flat" w14:cmpd="sng" w14:algn="ctr">
+            <w14:noFill/>
+            <w14:prstDash w14:val="solid"/>
+            <w14:round/>
+          </w14:textOutline>
+        </w:rPr>
+        <w:t xml:space="preserve">  </w:t>
+      </w:r>
+      <w:proofErr w:type="spellStart"/>
+      <w:r>
+        <w:rPr>
+          <w:bCs/>
+          <w:color w:val="000000" w:themeColor="text1"/>
+          <w:sz w:val="20"/>
+          <w:szCs w:val="20"/>
+          <w14:shadow w14:blurRad="38100" w14:dist="19050" w14:dir="2700000" w14:sx="100000" w14:sy="100000" w14:kx="0" w14:ky="0" w14:algn="tl">
+            <w14:schemeClr w14:val="dk1">
+              <w14:alpha w14:val="60000"/>
+            </w14:schemeClr>
+          </w14:shadow>
+          <w14:textOutline w14:w="0" w14:cap="flat" w14:cmpd="sng" w14:algn="ctr">
+            <w14:noFill/>
+            <w14:prstDash w14:val="solid"/>
+            <w14:round/>
+          </w14:textOutline>
+        </w:rPr>
+        <w:t>find</w:t>
+      </w:r>
+      <w:proofErr w:type="spellEnd"/>
+      <w:r>
+        <w:rPr>
+          <w:bCs/>
+          <w:color w:val="000000" w:themeColor="text1"/>
+          <w:sz w:val="20"/>
+          <w:szCs w:val="20"/>
+          <w14:shadow w14:blurRad="38100" w14:dist="19050" w14:dir="2700000" w14:sx="100000" w14:sy="100000" w14:kx="0" w14:ky="0" w14:algn="tl">
+            <w14:schemeClr w14:val="dk1">
+              <w14:alpha w14:val="60000"/>
+            </w14:schemeClr>
+          </w14:shadow>
+          <w14:textOutline w14:w="0" w14:cap="flat" w14:cmpd="sng" w14:algn="ctr">
+            <w14:noFill/>
+            <w14:prstDash w14:val="solid"/>
+            <w14:round/>
+          </w14:textOutline>
+        </w:rPr>
+        <w:t xml:space="preserve"> → buscar archivos </w:t>
+      </w:r>
+    </w:p>
+    <w:p>
+      <w:pPr>
+        <w:rPr>
+          <w:bCs/>
+          <w:color w:val="000000" w:themeColor="text1"/>
+          <w:sz w:val="20"/>
+          <w:szCs w:val="20"/>
+          <w14:shadow w14:blurRad="38100" w14:dist="19050" w14:dir="2700000" w14:sx="100000" w14:sy="100000" w14:kx="0" w14:ky="0" w14:algn="tl">
+            <w14:schemeClr w14:val="dk1">
+              <w14:alpha w14:val="60000"/>
+            </w14:schemeClr>
+          </w14:shadow>
+          <w14:textOutline w14:w="0" w14:cap="flat" w14:cmpd="sng" w14:algn="ctr">
+            <w14:noFill/>
+            <w14:prstDash w14:val="solid"/>
+            <w14:round/>
+          </w14:textOutline>
+        </w:rPr>
+      </w:pPr>
+      <w:r>
+        <w:rPr>
+          <w:bCs/>
+          <w:color w:val="000000" w:themeColor="text1"/>
+          <w:sz w:val="20"/>
+          <w:szCs w:val="20"/>
+          <w14:shadow w14:blurRad="38100" w14:dist="19050" w14:dir="2700000" w14:sx="100000" w14:sy="100000" w14:kx="0" w14:ky="0" w14:algn="tl">
+            <w14:schemeClr w14:val="dk1">
+              <w14:alpha w14:val="60000"/>
+            </w14:schemeClr>
+          </w14:shadow>
+          <w14:textOutline w14:w="0" w14:cap="flat" w14:cmpd="sng" w14:algn="ctr">
+            <w14:noFill/>
+            <w14:prstDash w14:val="solid"/>
+            <w14:round/>
+          </w14:textOutline>
+        </w:rPr>
+        <w:t xml:space="preserve">  </w:t>
+      </w:r>
+      <w:proofErr w:type="spellStart"/>
+      <w:r>
+        <w:rPr>
+          <w:bCs/>
+          <w:color w:val="000000" w:themeColor="text1"/>
+          <w:sz w:val="20"/>
+          <w:szCs w:val="20"/>
+          <w14:shadow w14:blurRad="38100" w14:dist="19050" w14:dir="2700000" w14:sx="100000" w14:sy="100000" w14:kx="0" w14:ky="0" w14:algn="tl">
+            <w14:schemeClr w14:val="dk1">
+              <w14:alpha w14:val="60000"/>
+            </w14:schemeClr>
+          </w14:shadow>
+          <w14:textOutline w14:w="0" w14:cap="flat" w14:cmpd="sng" w14:algn="ctr">
+            <w14:noFill/>
+            <w14:prstDash w14:val="solid"/>
+            <w14:round/>
+          </w14:textOutline>
+        </w:rPr>
+        <w:t>cp</w:t>
+      </w:r>
+      <w:proofErr w:type="spellEnd"/>
+      <w:r>
+        <w:rPr>
+          <w:bCs/>
+          <w:color w:val="000000" w:themeColor="text1"/>
+          <w:sz w:val="20"/>
+          <w:szCs w:val="20"/>
+          <w14:shadow w14:blurRad="38100" w14:dist="19050" w14:dir="2700000" w14:sx="100000" w14:sy="100000" w14:kx="0" w14:ky="0" w14:algn="tl">
+            <w14:schemeClr w14:val="dk1">
+              <w14:alpha w14:val="60000"/>
+            </w14:schemeClr>
+          </w14:shadow>
+          <w14:textOutline w14:w="0" w14:cap="flat" w14:cmpd="sng" w14:algn="ctr">
+            <w14:noFill/>
+            <w14:prstDash w14:val="solid"/>
+            <w14:round/>
+          </w14:textOutline>
+        </w:rPr>
+        <w:t xml:space="preserve">, </w:t>
+      </w:r>
+      <w:proofErr w:type="spellStart"/>
+      <w:r>
+        <w:rPr>
+          <w:bCs/>
+          <w:color w:val="000000" w:themeColor="text1"/>
+          <w:sz w:val="20"/>
+          <w:szCs w:val="20"/>
+          <w14:shadow w14:blurRad="38100" w14:dist="19050" w14:dir="2700000" w14:sx="100000" w14:sy="100000" w14:kx="0" w14:ky="0" w14:algn="tl">
+            <w14:schemeClr w14:val="dk1">
+              <w14:alpha w14:val="60000"/>
+            </w14:schemeClr>
+          </w14:shadow>
+          <w14:textOutline w14:w="0" w14:cap="flat" w14:cmpd="sng" w14:algn="ctr">
+            <w14:noFill/>
+            <w14:prstDash w14:val="solid"/>
+            <w14:round/>
+          </w14:textOutline>
+        </w:rPr>
+        <w:t>mv</w:t>
+      </w:r>
+      <w:proofErr w:type="spellEnd"/>
+      <w:r>
+        <w:rPr>
+          <w:bCs/>
+          <w:color w:val="000000" w:themeColor="text1"/>
+          <w:sz w:val="20"/>
+          <w:szCs w:val="20"/>
+          <w14:shadow w14:blurRad="38100" w14:dist="19050" w14:dir="2700000" w14:sx="100000" w14:sy="100000" w14:kx="0" w14:ky="0" w14:algn="tl">
+            <w14:schemeClr w14:val="dk1">
+              <w14:alpha w14:val="60000"/>
+            </w14:schemeClr>
+          </w14:shadow>
+          <w14:textOutline w14:w="0" w14:cap="flat" w14:cmpd="sng" w14:algn="ctr">
+            <w14:noFill/>
+            <w14:prstDash w14:val="solid"/>
+            <w14:round/>
+          </w14:textOutline>
+        </w:rPr>
+        <w:t xml:space="preserve"> → copiar y mover </w:t>
+      </w:r>
+    </w:p>
+    <w:p>
+      <w:pPr>
+        <w:rPr>
+          <w:bCs/>
+          <w:color w:val="000000" w:themeColor="text1"/>
+          <w:sz w:val="20"/>
+          <w:szCs w:val="20"/>
+          <w14:shadow w14:blurRad="38100" w14:dist="19050" w14:dir="2700000" w14:sx="100000" w14:sy="100000" w14:kx="0" w14:ky="0" w14:algn="tl">
+            <w14:schemeClr w14:val="dk1">
+              <w14:alpha w14:val="60000"/>
+            </w14:schemeClr>
+          </w14:shadow>
+          <w14:textOutline w14:w="0" w14:cap="flat" w14:cmpd="sng" w14:algn="ctr">
+            <w14:noFill/>
+            <w14:prstDash w14:val="solid"/>
+            <w14:round/>
+          </w14:textOutline>
+        </w:rPr>
+      </w:pPr>
+      <w:r>
+        <w:rPr>
+          <w:bCs/>
+          <w:color w:val="000000" w:themeColor="text1"/>
+          <w:sz w:val="20"/>
+          <w:szCs w:val="20"/>
+          <w14:shadow w14:blurRad="38100" w14:dist="19050" w14:dir="2700000" w14:sx="100000" w14:sy="100000" w14:kx="0" w14:ky="0" w14:algn="tl">
+            <w14:schemeClr w14:val="dk1">
+              <w14:alpha w14:val="60000"/>
+            </w14:schemeClr>
+          </w14:shadow>
+          <w14:textOutline w14:w="0" w14:cap="flat" w14:cmpd="sng" w14:algn="ctr">
+            <w14:noFill/>
+            <w14:prstDash w14:val="solid"/>
+            <w14:round/>
+          </w14:textOutline>
+        </w:rPr>
+        <w:t xml:space="preserve">  </w:t>
+      </w:r>
+      <w:proofErr w:type="spellStart"/>
+      <w:r>
+        <w:rPr>
+          <w:bCs/>
+          <w:color w:val="000000" w:themeColor="text1"/>
+          <w:sz w:val="20"/>
+          <w:szCs w:val="20"/>
+          <w14:shadow w14:blurRad="38100" w14:dist="19050" w14:dir="2700000" w14:sx="100000" w14:sy="100000" w14:kx="0" w14:ky="0" w14:algn="tl">
+            <w14:schemeClr w14:val="dk1">
+              <w14:alpha w14:val="60000"/>
+            </w14:schemeClr>
+          </w14:shadow>
+          <w14:textOutline w14:w="0" w14:cap="flat" w14:cmpd="sng" w14:algn="ctr">
+            <w14:noFill/>
+            <w14:prstDash w14:val="solid"/>
+            <w14:round/>
+          </w14:textOutline>
+        </w:rPr>
+        <w:t>chmod</w:t>
+      </w:r>
+      <w:proofErr w:type="spellEnd"/>
+      <w:r>
+        <w:rPr>
+          <w:bCs/>
+          <w:color w:val="000000" w:themeColor="text1"/>
+          <w:sz w:val="20"/>
+          <w:szCs w:val="20"/>
+          <w14:shadow w14:blurRad="38100" w14:dist="19050" w14:dir="2700000" w14:sx="100000" w14:sy="100000" w14:kx="0" w14:ky="0" w14:algn="tl">
+            <w14:schemeClr w14:val="dk1">
+              <w14:alpha w14:val="60000"/>
+            </w14:schemeClr>
+          </w14:shadow>
+          <w14:textOutline w14:w="0" w14:cap="flat" w14:cmpd="sng" w14:algn="ctr">
+            <w14:noFill/>
+            <w14:prstDash w14:val="solid"/>
+            <w14:round/>
+          </w14:textOutline>
+        </w:rPr>
+        <w:t xml:space="preserve">, </w:t>
+      </w:r>
+      <w:proofErr w:type="spellStart"/>
+      <w:r>
+        <w:rPr>
+          <w:bCs/>
+          <w:color w:val="000000" w:themeColor="text1"/>
+          <w:sz w:val="20"/>
+          <w:szCs w:val="20"/>
+          <w14:shadow w14:blurRad="38100" w14:dist="19050" w14:dir="2700000" w14:sx="100000" w14:sy="100000" w14:kx="0" w14:ky="0" w14:algn="tl">
+            <w14:schemeClr w14:val="dk1">
+              <w14:alpha w14:val="60000"/>
+            </w14:schemeClr>
+          </w14:shadow>
+          <w14:textOutline w14:w="0" w14:cap="flat" w14:cmpd="sng" w14:algn="ctr">
+            <w14:noFill/>
+            <w14:prstDash w14:val="solid"/>
+            <w14:round/>
+          </w14:textOutline>
+        </w:rPr>
+        <w:t>chown</w:t>
+      </w:r>
+      <w:proofErr w:type="spellEnd"/>
+      <w:r>
+        <w:rPr>
+          <w:bCs/>
+          <w:color w:val="000000" w:themeColor="text1"/>
+          <w:sz w:val="20"/>
+          <w:szCs w:val="20"/>
+          <w14:shadow w14:blurRad="38100" w14:dist="19050" w14:dir="2700000" w14:sx="100000" w14:sy="100000" w14:kx="0" w14:ky="0" w14:algn="tl">
+            <w14:schemeClr w14:val="dk1">
+              <w14:alpha w14:val="60000"/>
+            </w14:schemeClr>
+          </w14:shadow>
+          <w14:textOutline w14:w="0" w14:cap="flat" w14:cmpd="sng" w14:algn="ctr">
+            <w14:noFill/>
+            <w14:prstDash w14:val="solid"/>
+            <w14:round/>
+          </w14:textOutline>
+        </w:rPr>
+        <w:t xml:space="preserve"> → permisos</w:t>
       </w:r>
     </w:p>
     <w:sectPr>
@@ -720,7 +1578,6 @@
   <w:style w:type="character" w:default="1" w:styleId="Fuentedeprrafopredeter">
     <w:name w:val="Default Paragraph Font"/>
     <w:uiPriority w:val="1"/>
-    <w:semiHidden/>
     <w:unhideWhenUsed/>
   </w:style>
   <w:style w:type="table" w:default="1" w:styleId="Tablanormal">

</xml_diff>